<commit_message>
Diagramas: set completo de 18 (uno por procedimiento) con fuentes SVG; corrige ANCI
- Genera un diagrama de flujo (BPMN, PNG) por cada uno de los 18 procedimientos,
  con su fuente editable .svg en 03-evidencias/diagramas/fuentes-svg/ (rsvg-convert).
- Corrige PROC-SGSI-05: plazos ANCI 3 h / 72 h (24 h OIV) / 15 días corridos.
- Reemplaza los diagramas antiguos inconsistentes (quedan en el historial de git).
- Reescribe "Evidencias de diagramas.docx" como índice de los 18 diagramas.
- Actualiza READMEs (raíz, 03-evidencias, 02-procedimientos) y Gap Analysis.

Co-Authored-By: Claude Opus 4.8 (1M context) <noreply@anthropic.com>
</commit_message>
<xml_diff>
--- a/03-evidencias/Evidencias de diagramas.docx
+++ b/03-evidencias/Evidencias de diagramas.docx
@@ -2,552 +2,767 @@
 <file path=word/document.xml><?xml version="1.0" encoding="utf-8"?>
 <w:document xmlns:wpc="http://schemas.microsoft.com/office/word/2010/wordprocessingCanvas" xmlns:cx="http://schemas.microsoft.com/office/drawing/2014/chartex" xmlns:cx1="http://schemas.microsoft.com/office/drawing/2015/9/8/chartex" xmlns:cx2="http://schemas.microsoft.com/office/drawing/2015/10/21/chartex" xmlns:mc="http://schemas.openxmlformats.org/markup-compatibility/2006" xmlns:o="urn:schemas-microsoft-com:office:office" xmlns:r="http://schemas.openxmlformats.org/officeDocument/2006/relationships" xmlns:m="http://schemas.openxmlformats.org/officeDocument/2006/math" xmlns:v="urn:schemas-microsoft-com:vml" xmlns:wp14="http://schemas.microsoft.com/office/word/2010/wordprocessingDrawing" xmlns:wp="http://schemas.openxmlformats.org/drawingml/2006/wordprocessingDrawing" xmlns:w10="urn:schemas-microsoft-com:office:word" xmlns:w="http://schemas.openxmlformats.org/wordprocessingml/2006/main" xmlns:w14="http://schemas.microsoft.com/office/word/2010/wordml" xmlns:w15="http://schemas.microsoft.com/office/word/2012/wordml" xmlns:w16se="http://schemas.microsoft.com/office/word/2015/wordml/symex" xmlns:wpg="http://schemas.microsoft.com/office/word/2010/wordprocessingGroup" xmlns:wpi="http://schemas.microsoft.com/office/word/2010/wordprocessingInk" xmlns:wne="http://schemas.microsoft.com/office/word/2006/wordml" xmlns:wps="http://schemas.microsoft.com/office/word/2010/wordprocessingShape" mc:Ignorable="w14 w15 w16se wp14">
   <w:body>
-    <w:p xmlns:wp14="http://schemas.microsoft.com/office/word/2010/wordml" wp14:textId="77777777">
-      <w:pPr>
-        <w:rPr>
-          <w:b/>
-          <w:bCs/>
-        </w:rPr>
-      </w:pPr>
+    <w:p>
       <w:r>
         <w:rPr>
           <w:b/>
-          <w:bCs/>
+          <w:sz w:val="28"/>
         </w:rPr>
-        <w:t>1. Diagrama BPMN: Procedimiento de Desvinculación Segura y Prevención de Fuga de Datos (DLP)</w:t>
+        <w:t>Evidencias de diagramas BPMN del SGSI — NovaRetail SpA</w:t>
       </w:r>
     </w:p>
-    <w:p xmlns:wp14="http://schemas.microsoft.com/office/word/2010/wordml" wp14:textId="77777777">
+    <w:p>
       <w:r>
-        <w:rPr>
-          <w:b/>
-          <w:bCs/>
-        </w:rPr>
-        <w:t>Políticas y Procedimientos que lo fundamentan:</w:t>
+        <w:t>La carpeta 03-evidencias/diagramas/ contiene un diagrama de flujo (BPMN) por cada uno de los 18 procedimientos del SGSI. Cada PNG va acompañado de su fuente editable en formato SVG (subcarpeta fuentes-svg/). Los diagramas modelan el flujo operativo del procedimiento y su trazabilidad con la política base.</w:t>
       </w:r>
     </w:p>
-    <w:p xmlns:wp14="http://schemas.microsoft.com/office/word/2010/wordml" wp14:textId="77777777">
-      <w:pPr>
-        <w:numPr>
-          <w:ilvl w:val="0"/>
-          <w:numId w:val="1"/>
-        </w:numPr>
-      </w:pPr>
+    <w:p>
       <w:r>
-        <w:rPr>
-          <w:b/>
-          <w:bCs/>
-        </w:rPr>
-        <w:t>POL-SGSI-14 — Política de contratación y desvinculación:</w:t>
-      </w:r>
-      <w:r>
-        <w:t xml:space="preserve"> Dicta las obligaciones de seguridad al término de la relación laboral. </w:t>
+        <w:t>Nota: el diagrama de PROC-SGSI-05 (gestión de incidentes) refleja los plazos de notificación de la Ley N° 21.663: alerta temprana ≤ 3 horas, actualización ≤ 72 horas (24 horas si la empresa es OIV y afecta un servicio esencial) e informe final ≤ 15 días corridos.</w:t>
       </w:r>
     </w:p>
-    <w:p xmlns:wp14="http://schemas.microsoft.com/office/word/2010/wordml" wp14:textId="77777777">
-      <w:pPr>
-        <w:numPr>
-          <w:ilvl w:val="0"/>
-          <w:numId w:val="1"/>
-        </w:numPr>
-      </w:pPr>
+    <w:tbl>
+      <w:tblPr>
+        <w:tblW w:type="auto" w:w="0"/>
+        <w:tblLook w:firstColumn="1" w:firstRow="1" w:lastColumn="0" w:lastRow="0" w:noHBand="0" w:noVBand="1" w:val="04A0"/>
+        <w:tblBorders>
+          <w:top w:val="single" w:sz="4" w:color="808080"/>
+          <w:left w:val="single" w:sz="4" w:color="808080"/>
+          <w:bottom w:val="single" w:sz="4" w:color="808080"/>
+          <w:right w:val="single" w:sz="4" w:color="808080"/>
+          <w:insideH w:val="single" w:sz="4" w:color="808080"/>
+          <w:insideV w:val="single" w:sz="4" w:color="808080"/>
+        </w:tblBorders>
+      </w:tblPr>
+      <w:tblGrid>
+        <w:gridCol w:w="2946"/>
+        <w:gridCol w:w="2946"/>
+        <w:gridCol w:w="2946"/>
+      </w:tblGrid>
+      <w:tr>
+        <w:tc>
+          <w:tcPr>
+            <w:tcW w:type="dxa" w:w="2946"/>
+          </w:tcPr>
+          <w:p>
+            <w:r>
+              <w:rPr>
+                <w:b/>
+              </w:rPr>
+              <w:t>Código</w:t>
+            </w:r>
+          </w:p>
+        </w:tc>
+        <w:tc>
+          <w:tcPr>
+            <w:tcW w:type="dxa" w:w="2946"/>
+          </w:tcPr>
+          <w:p>
+            <w:r>
+              <w:rPr>
+                <w:b/>
+              </w:rPr>
+              <w:t>Diagrama (flujo modelado)</w:t>
+            </w:r>
+          </w:p>
+        </w:tc>
+        <w:tc>
+          <w:tcPr>
+            <w:tcW w:type="dxa" w:w="2946"/>
+          </w:tcPr>
+          <w:p>
+            <w:r>
+              <w:rPr>
+                <w:b/>
+              </w:rPr>
+              <w:t>Política base</w:t>
+            </w:r>
+          </w:p>
+        </w:tc>
+      </w:tr>
+      <w:tr>
+        <w:tc>
+          <w:tcPr>
+            <w:tcW w:type="dxa" w:w="2946"/>
+          </w:tcPr>
+          <w:p>
+            <w:r>
+              <w:t>PROC-SGSI-01</w:t>
+            </w:r>
+          </w:p>
+        </w:tc>
+        <w:tc>
+          <w:tcPr>
+            <w:tcW w:type="dxa" w:w="2946"/>
+          </w:tcPr>
+          <w:p>
+            <w:r>
+              <w:t>Gestión de actualizaciones y parches</w:t>
+            </w:r>
+          </w:p>
+        </w:tc>
+        <w:tc>
+          <w:tcPr>
+            <w:tcW w:type="dxa" w:w="2946"/>
+          </w:tcPr>
+          <w:p>
+            <w:r>
+              <w:t>POL-SGSI-05</w:t>
+            </w:r>
+          </w:p>
+        </w:tc>
+      </w:tr>
+      <w:tr>
+        <w:tc>
+          <w:tcPr>
+            <w:tcW w:type="dxa" w:w="2946"/>
+          </w:tcPr>
+          <w:p>
+            <w:r>
+              <w:t>PROC-SGSI-02</w:t>
+            </w:r>
+          </w:p>
+        </w:tc>
+        <w:tc>
+          <w:tcPr>
+            <w:tcW w:type="dxa" w:w="2946"/>
+          </w:tcPr>
+          <w:p>
+            <w:r>
+              <w:t>Backup de base de datos</w:t>
+            </w:r>
+          </w:p>
+        </w:tc>
+        <w:tc>
+          <w:tcPr>
+            <w:tcW w:type="dxa" w:w="2946"/>
+          </w:tcPr>
+          <w:p>
+            <w:r>
+              <w:t>POL-SGSI-03</w:t>
+            </w:r>
+          </w:p>
+        </w:tc>
+      </w:tr>
+      <w:tr>
+        <w:tc>
+          <w:tcPr>
+            <w:tcW w:type="dxa" w:w="2946"/>
+          </w:tcPr>
+          <w:p>
+            <w:r>
+              <w:t>PROC-SGSI-03</w:t>
+            </w:r>
+          </w:p>
+        </w:tc>
+        <w:tc>
+          <w:tcPr>
+            <w:tcW w:type="dxa" w:w="2946"/>
+          </w:tcPr>
+          <w:p>
+            <w:r>
+              <w:t>Rollback</w:t>
+            </w:r>
+          </w:p>
+        </w:tc>
+        <w:tc>
+          <w:tcPr>
+            <w:tcW w:type="dxa" w:w="2946"/>
+          </w:tcPr>
+          <w:p>
+            <w:r>
+              <w:t>POL-SGSI-03</w:t>
+            </w:r>
+          </w:p>
+        </w:tc>
+      </w:tr>
+      <w:tr>
+        <w:tc>
+          <w:tcPr>
+            <w:tcW w:type="dxa" w:w="2946"/>
+          </w:tcPr>
+          <w:p>
+            <w:r>
+              <w:t>PROC-SGSI-04</w:t>
+            </w:r>
+          </w:p>
+        </w:tc>
+        <w:tc>
+          <w:tcPr>
+            <w:tcW w:type="dxa" w:w="2946"/>
+          </w:tcPr>
+          <w:p>
+            <w:r>
+              <w:t>Línea base de software (Ansible)</w:t>
+            </w:r>
+          </w:p>
+        </w:tc>
+        <w:tc>
+          <w:tcPr>
+            <w:tcW w:type="dxa" w:w="2946"/>
+          </w:tcPr>
+          <w:p>
+            <w:r>
+              <w:t>POL-SGSI-15</w:t>
+            </w:r>
+          </w:p>
+        </w:tc>
+      </w:tr>
+      <w:tr>
+        <w:tc>
+          <w:tcPr>
+            <w:tcW w:type="dxa" w:w="2946"/>
+          </w:tcPr>
+          <w:p>
+            <w:r>
+              <w:t>PROC-SGSI-05</w:t>
+            </w:r>
+          </w:p>
+        </w:tc>
+        <w:tc>
+          <w:tcPr>
+            <w:tcW w:type="dxa" w:w="2946"/>
+          </w:tcPr>
+          <w:p>
+            <w:r>
+              <w:t>Gestión de incidentes y notificación ANCI</w:t>
+            </w:r>
+          </w:p>
+        </w:tc>
+        <w:tc>
+          <w:tcPr>
+            <w:tcW w:type="dxa" w:w="2946"/>
+          </w:tcPr>
+          <w:p>
+            <w:r>
+              <w:t>POL-SGSI-11</w:t>
+            </w:r>
+          </w:p>
+        </w:tc>
+      </w:tr>
+      <w:tr>
+        <w:tc>
+          <w:tcPr>
+            <w:tcW w:type="dxa" w:w="2946"/>
+          </w:tcPr>
+          <w:p>
+            <w:r>
+              <w:t>PROC-SGSI-06</w:t>
+            </w:r>
+          </w:p>
+        </w:tc>
+        <w:tc>
+          <w:tcPr>
+            <w:tcW w:type="dxa" w:w="2946"/>
+          </w:tcPr>
+          <w:p>
+            <w:r>
+              <w:t>Alta, modificación y baja de accesos</w:t>
+            </w:r>
+          </w:p>
+        </w:tc>
+        <w:tc>
+          <w:tcPr>
+            <w:tcW w:type="dxa" w:w="2946"/>
+          </w:tcPr>
+          <w:p>
+            <w:r>
+              <w:t>POL-SGSI-01</w:t>
+            </w:r>
+          </w:p>
+        </w:tc>
+      </w:tr>
+      <w:tr>
+        <w:tc>
+          <w:tcPr>
+            <w:tcW w:type="dxa" w:w="2946"/>
+          </w:tcPr>
+          <w:p>
+            <w:r>
+              <w:t>PROC-SGSI-07</w:t>
+            </w:r>
+          </w:p>
+        </w:tc>
+        <w:tc>
+          <w:tcPr>
+            <w:tcW w:type="dxa" w:w="2946"/>
+          </w:tcPr>
+          <w:p>
+            <w:r>
+              <w:t>Revisión periódica de accesos</w:t>
+            </w:r>
+          </w:p>
+        </w:tc>
+        <w:tc>
+          <w:tcPr>
+            <w:tcW w:type="dxa" w:w="2946"/>
+          </w:tcPr>
+          <w:p>
+            <w:r>
+              <w:t>POL-SGSI-01</w:t>
+            </w:r>
+          </w:p>
+        </w:tc>
+      </w:tr>
+      <w:tr>
+        <w:tc>
+          <w:tcPr>
+            <w:tcW w:type="dxa" w:w="2946"/>
+          </w:tcPr>
+          <w:p>
+            <w:r>
+              <w:t>PROC-SGSI-08</w:t>
+            </w:r>
+          </w:p>
+        </w:tc>
+        <w:tc>
+          <w:tcPr>
+            <w:tcW w:type="dxa" w:w="2946"/>
+          </w:tcPr>
+          <w:p>
+            <w:r>
+              <w:t>Uso del gestor de contraseñas</w:t>
+            </w:r>
+          </w:p>
+        </w:tc>
+        <w:tc>
+          <w:tcPr>
+            <w:tcW w:type="dxa" w:w="2946"/>
+          </w:tcPr>
+          <w:p>
+            <w:r>
+              <w:t>POL-SGSI-02</w:t>
+            </w:r>
+          </w:p>
+        </w:tc>
+      </w:tr>
+      <w:tr>
+        <w:tc>
+          <w:tcPr>
+            <w:tcW w:type="dxa" w:w="2946"/>
+          </w:tcPr>
+          <w:p>
+            <w:r>
+              <w:t>PROC-SGSI-09</w:t>
+            </w:r>
+          </w:p>
+        </w:tc>
+        <w:tc>
+          <w:tcPr>
+            <w:tcW w:type="dxa" w:w="2946"/>
+          </w:tcPr>
+          <w:p>
+            <w:r>
+              <w:t>Segmentación y revisión de firewall</w:t>
+            </w:r>
+          </w:p>
+        </w:tc>
+        <w:tc>
+          <w:tcPr>
+            <w:tcW w:type="dxa" w:w="2946"/>
+          </w:tcPr>
+          <w:p>
+            <w:r>
+              <w:t>POL-SGSI-07</w:t>
+            </w:r>
+          </w:p>
+        </w:tc>
+      </w:tr>
+      <w:tr>
+        <w:tc>
+          <w:tcPr>
+            <w:tcW w:type="dxa" w:w="2946"/>
+          </w:tcPr>
+          <w:p>
+            <w:r>
+              <w:t>PROC-SGSI-10</w:t>
+            </w:r>
+          </w:p>
+        </w:tc>
+        <w:tc>
+          <w:tcPr>
+            <w:tcW w:type="dxa" w:w="2946"/>
+          </w:tcPr>
+          <w:p>
+            <w:r>
+              <w:t>Revisión y escalada de alertas</w:t>
+            </w:r>
+          </w:p>
+        </w:tc>
+        <w:tc>
+          <w:tcPr>
+            <w:tcW w:type="dxa" w:w="2946"/>
+          </w:tcPr>
+          <w:p>
+            <w:r>
+              <w:t>POL-SGSI-08</w:t>
+            </w:r>
+          </w:p>
+        </w:tc>
+      </w:tr>
+      <w:tr>
+        <w:tc>
+          <w:tcPr>
+            <w:tcW w:type="dxa" w:w="2946"/>
+          </w:tcPr>
+          <w:p>
+            <w:r>
+              <w:t>PROC-SGSI-11</w:t>
+            </w:r>
+          </w:p>
+        </w:tc>
+        <w:tc>
+          <w:tcPr>
+            <w:tcW w:type="dxa" w:w="2946"/>
+          </w:tcPr>
+          <w:p>
+            <w:r>
+              <w:t>Escaneo de vulnerabilidades</w:t>
+            </w:r>
+          </w:p>
+        </w:tc>
+        <w:tc>
+          <w:tcPr>
+            <w:tcW w:type="dxa" w:w="2946"/>
+          </w:tcPr>
+          <w:p>
+            <w:r>
+              <w:t>POL-SGSI-09</w:t>
+            </w:r>
+          </w:p>
+        </w:tc>
+      </w:tr>
+      <w:tr>
+        <w:tc>
+          <w:tcPr>
+            <w:tcW w:type="dxa" w:w="2946"/>
+          </w:tcPr>
+          <w:p>
+            <w:r>
+              <w:t>PROC-SGSI-12</w:t>
+            </w:r>
+          </w:p>
+        </w:tc>
+        <w:tc>
+          <w:tcPr>
+            <w:tcW w:type="dxa" w:w="2946"/>
+          </w:tcPr>
+          <w:p>
+            <w:r>
+              <w:t>Retención y eliminación segura</w:t>
+            </w:r>
+          </w:p>
+        </w:tc>
+        <w:tc>
+          <w:tcPr>
+            <w:tcW w:type="dxa" w:w="2946"/>
+          </w:tcPr>
+          <w:p>
+            <w:r>
+              <w:t>POL-SGSI-10</w:t>
+            </w:r>
+          </w:p>
+        </w:tc>
+      </w:tr>
+      <w:tr>
+        <w:tc>
+          <w:tcPr>
+            <w:tcW w:type="dxa" w:w="2946"/>
+          </w:tcPr>
+          <w:p>
+            <w:r>
+              <w:t>PROC-SGSI-13</w:t>
+            </w:r>
+          </w:p>
+        </w:tc>
+        <w:tc>
+          <w:tcPr>
+            <w:tcW w:type="dxa" w:w="2946"/>
+          </w:tcPr>
+          <w:p>
+            <w:r>
+              <w:t>Contratación y desvinculación</w:t>
+            </w:r>
+          </w:p>
+        </w:tc>
+        <w:tc>
+          <w:tcPr>
+            <w:tcW w:type="dxa" w:w="2946"/>
+          </w:tcPr>
+          <w:p>
+            <w:r>
+              <w:t>POL-SGSI-14</w:t>
+            </w:r>
+          </w:p>
+        </w:tc>
+      </w:tr>
+      <w:tr>
+        <w:tc>
+          <w:tcPr>
+            <w:tcW w:type="dxa" w:w="2946"/>
+          </w:tcPr>
+          <w:p>
+            <w:r>
+              <w:t>PROC-SGSI-14</w:t>
+            </w:r>
+          </w:p>
+        </w:tc>
+        <w:tc>
+          <w:tcPr>
+            <w:tcW w:type="dxa" w:w="2946"/>
+          </w:tcPr>
+          <w:p>
+            <w:r>
+              <w:t>Evaluación de proveedores</w:t>
+            </w:r>
+          </w:p>
+        </w:tc>
+        <w:tc>
+          <w:tcPr>
+            <w:tcW w:type="dxa" w:w="2946"/>
+          </w:tcPr>
+          <w:p>
+            <w:r>
+              <w:t>POL-SGSI-13</w:t>
+            </w:r>
+          </w:p>
+        </w:tc>
+      </w:tr>
+      <w:tr>
+        <w:tc>
+          <w:tcPr>
+            <w:tcW w:type="dxa" w:w="2946"/>
+          </w:tcPr>
+          <w:p>
+            <w:r>
+              <w:t>PROC-SGSI-15</w:t>
+            </w:r>
+          </w:p>
+        </w:tc>
+        <w:tc>
+          <w:tcPr>
+            <w:tcW w:type="dxa" w:w="2946"/>
+          </w:tcPr>
+          <w:p>
+            <w:r>
+              <w:t>Desarrollo seguro (SDLC)</w:t>
+            </w:r>
+          </w:p>
+        </w:tc>
+        <w:tc>
+          <w:tcPr>
+            <w:tcW w:type="dxa" w:w="2946"/>
+          </w:tcPr>
+          <w:p>
+            <w:r>
+              <w:t>POL-SGSI-15 / 09</w:t>
+            </w:r>
+          </w:p>
+        </w:tc>
+      </w:tr>
+      <w:tr>
+        <w:tc>
+          <w:tcPr>
+            <w:tcW w:type="dxa" w:w="2946"/>
+          </w:tcPr>
+          <w:p>
+            <w:r>
+              <w:t>PROC-SGSI-16</w:t>
+            </w:r>
+          </w:p>
+        </w:tc>
+        <w:tc>
+          <w:tcPr>
+            <w:tcW w:type="dxa" w:w="2946"/>
+          </w:tcPr>
+          <w:p>
+            <w:r>
+              <w:t>Respuesta ante malware</w:t>
+            </w:r>
+          </w:p>
+        </w:tc>
+        <w:tc>
+          <w:tcPr>
+            <w:tcW w:type="dxa" w:w="2946"/>
+          </w:tcPr>
+          <w:p>
+            <w:r>
+              <w:t>POL-SGSI-04</w:t>
+            </w:r>
+          </w:p>
+        </w:tc>
+      </w:tr>
+      <w:tr>
+        <w:tc>
+          <w:tcPr>
+            <w:tcW w:type="dxa" w:w="2946"/>
+          </w:tcPr>
+          <w:p>
+            <w:r>
+              <w:t>PROC-SGSI-17</w:t>
+            </w:r>
+          </w:p>
+        </w:tc>
+        <w:tc>
+          <w:tcPr>
+            <w:tcW w:type="dxa" w:w="2946"/>
+          </w:tcPr>
+          <w:p>
+            <w:r>
+              <w:t>Uso seguro de dispositivos</w:t>
+            </w:r>
+          </w:p>
+        </w:tc>
+        <w:tc>
+          <w:tcPr>
+            <w:tcW w:type="dxa" w:w="2946"/>
+          </w:tcPr>
+          <w:p>
+            <w:r>
+              <w:t>POL-SGSI-06</w:t>
+            </w:r>
+          </w:p>
+        </w:tc>
+      </w:tr>
+      <w:tr>
+        <w:tc>
+          <w:tcPr>
+            <w:tcW w:type="dxa" w:w="2946"/>
+          </w:tcPr>
+          <w:p>
+            <w:r>
+              <w:t>PROC-SGSI-18</w:t>
+            </w:r>
+          </w:p>
+        </w:tc>
+        <w:tc>
+          <w:tcPr>
+            <w:tcW w:type="dxa" w:w="2946"/>
+          </w:tcPr>
+          <w:p>
+            <w:r>
+              <w:t>Cifrado y gestión de llaves</w:t>
+            </w:r>
+          </w:p>
+        </w:tc>
+        <w:tc>
+          <w:tcPr>
+            <w:tcW w:type="dxa" w:w="2946"/>
+          </w:tcPr>
+          <w:p>
+            <w:r>
+              <w:t>POL-SGSI-12</w:t>
+            </w:r>
+          </w:p>
+        </w:tc>
+      </w:tr>
+    </w:tbl>
+    <w:p>
       <w:r>
-        <w:rPr>
-          <w:b/>
-          <w:bCs/>
-        </w:rPr>
-        <w:t>POL-SGSI-01 — Política de control de acceso:</w:t>
+        <w:t>Fuente editable: cada diagrama tiene su archivo .svg en 03-evidencias/diagramas/fuentes-svg/, regenerable a PNG.</w:t>
       </w:r>
-      <w:r>
-        <w:t xml:space="preserve"> Exige la revocación de accesos el mismo día de la desvinculación (o dentro de 1 hora en casos graves). </w:t>
-      </w:r>
-    </w:p>
-    <w:p xmlns:wp14="http://schemas.microsoft.com/office/word/2010/wordml" wp14:textId="77777777">
-      <w:pPr>
-        <w:numPr>
-          <w:ilvl w:val="0"/>
-          <w:numId w:val="1"/>
-        </w:numPr>
-      </w:pPr>
-      <w:r>
-        <w:rPr>
-          <w:b/>
-          <w:bCs/>
-        </w:rPr>
-        <w:t>PROC-SGSI-06 — Procedimiento de alta, modificación y baja de accesos (Proceso C):</w:t>
-      </w:r>
-      <w:r>
-        <w:t xml:space="preserve"> Detalla los pasos operativos de RRHH y TI para la desactivación de cuentas. </w:t>
-      </w:r>
-    </w:p>
-    <w:p xmlns:wp14="http://schemas.microsoft.com/office/word/2010/wordml" wp14:textId="77777777">
-      <w:r>
-        <w:rPr>
-          <w:b/>
-          <w:bCs/>
-        </w:rPr>
-        <w:t>Justificación del Flujo:</w:t>
-      </w:r>
-      <w:r>
-        <w:t xml:space="preserve"> El diagrama modela la interacción obligatoria entre Recursos Humanos y Gerencia TI. La inclusión de la compuerta lógica del si</w:t>
-      </w:r>
-      <w:r>
-        <w:t>stema DLP</w:t>
-      </w:r>
-      <w:r>
-        <w:t xml:space="preserve"> responde a la necesidad de proteger la información clasificada como "Confidencial", automatizando el bloqueo de correos salientes con datos sensibles durante el proceso de salida del colaborador, mitigando el riesgo de </w:t>
-      </w:r>
-      <w:proofErr w:type="spellStart"/>
-      <w:r>
-        <w:t>exfiltración</w:t>
-      </w:r>
-      <w:proofErr w:type="spellEnd"/>
-      <w:r>
-        <w:t>.</w:t>
-      </w:r>
-    </w:p>
-    <w:p xmlns:wp14="http://schemas.microsoft.com/office/word/2010/wordml" wp14:textId="62CD9329">
-      <w:pPr>
-        <w:rPr>
-          <w:b w:val="1"/>
-          <w:bCs w:val="1"/>
-        </w:rPr>
-      </w:pPr>
-      <w:r>
-        <w:rPr>
-          <w:b w:val="1"/>
-          <w:bCs w:val="1"/>
-        </w:rPr>
-        <w:t>2. Diagrama BPMN: Gestión de Actualizaciones</w:t>
-      </w:r>
-      <w:r>
-        <w:rPr>
-          <w:b w:val="1"/>
-          <w:bCs w:val="1"/>
-        </w:rPr>
-        <w:t xml:space="preserve"> y</w:t>
-      </w:r>
-      <w:r>
-        <w:rPr>
-          <w:b w:val="1"/>
-          <w:bCs w:val="1"/>
-        </w:rPr>
-        <w:t xml:space="preserve"> Parcheado</w:t>
-      </w:r>
-    </w:p>
-    <w:p xmlns:wp14="http://schemas.microsoft.com/office/word/2010/wordml" wp14:textId="77777777">
-      <w:r>
-        <w:rPr>
-          <w:b/>
-          <w:bCs/>
-        </w:rPr>
-        <w:t>Políticas y Procedimientos que lo fundamentan:</w:t>
-      </w:r>
-    </w:p>
-    <w:p xmlns:wp14="http://schemas.microsoft.com/office/word/2010/wordml" wp14:textId="77777777">
-      <w:pPr>
-        <w:numPr>
-          <w:ilvl w:val="0"/>
-          <w:numId w:val="2"/>
-        </w:numPr>
-      </w:pPr>
-      <w:r>
-        <w:rPr>
-          <w:b/>
-          <w:bCs/>
-        </w:rPr>
-        <w:t>POL-SGSI-05 — Política de gestión de parches y actualizaciones:</w:t>
-      </w:r>
-      <w:r>
-        <w:t xml:space="preserve"> Establece la diferenciación explícita entre parches que requieren reinicio (ej. </w:t>
-      </w:r>
-      <w:proofErr w:type="spellStart"/>
-      <w:r>
-        <w:t>Kernel</w:t>
-      </w:r>
-      <w:proofErr w:type="spellEnd"/>
-      <w:r>
-        <w:t xml:space="preserve">) y aquellos que se aplican en caliente. </w:t>
-      </w:r>
-    </w:p>
-    <w:p xmlns:wp14="http://schemas.microsoft.com/office/word/2010/wordml" wp14:textId="77777777">
-      <w:pPr>
-        <w:numPr>
-          <w:ilvl w:val="0"/>
-          <w:numId w:val="2"/>
-        </w:numPr>
-      </w:pPr>
-      <w:r>
-        <w:rPr>
-          <w:b/>
-          <w:bCs/>
-        </w:rPr>
-        <w:t>POL-SGSI-15 — Política de línea base de software:</w:t>
-      </w:r>
-      <w:r>
-        <w:t xml:space="preserve"> Define el uso de herramientas de automatización y configuración segura para mantener la homogeneidad. </w:t>
-      </w:r>
-    </w:p>
-    <w:p xmlns:wp14="http://schemas.microsoft.com/office/word/2010/wordml" wp14:textId="77777777">
-      <w:pPr>
-        <w:numPr>
-          <w:ilvl w:val="0"/>
-          <w:numId w:val="2"/>
-        </w:numPr>
-      </w:pPr>
-      <w:r>
-        <w:rPr>
-          <w:b/>
-          <w:bCs/>
-        </w:rPr>
-        <w:t>PROC-SGSI-01 — Procedimiento de gestión de actualizaciones y parches:</w:t>
-      </w:r>
-      <w:r>
-        <w:t xml:space="preserve"> Establece los SLA de a</w:t>
-      </w:r>
-      <w:r>
-        <w:t>plicación</w:t>
-      </w:r>
-      <w:r>
-        <w:t xml:space="preserve"> y las ventanas de mantenimiento. </w:t>
-      </w:r>
-    </w:p>
-    <w:p xmlns:wp14="http://schemas.microsoft.com/office/word/2010/wordml" wp14:textId="77777777">
-      <w:r>
-        <w:rPr>
-          <w:b/>
-          <w:bCs/>
-        </w:rPr>
-        <w:t>Justificación del Flujo:</w:t>
-      </w:r>
-      <w:r>
-        <w:t xml:space="preserve"> El diagrama visualiza la lógica de ramificación exigida por la norma interna: si el parche afecta componentes </w:t>
-      </w:r>
-      <w:r>
-        <w:t>críticos</w:t>
-      </w:r>
-      <w:r>
-        <w:t>, el flujo obliga a derivar la tarea hacia la programación de una ventana de mantenimiento fuera de horario. Si es una actualización estándar, el flujo autoriza el uso de automatización (</w:t>
-      </w:r>
-      <w:proofErr w:type="spellStart"/>
-      <w:r>
-        <w:t>Ansible</w:t>
-      </w:r>
-      <w:proofErr w:type="spellEnd"/>
-      <w:r>
-        <w:t>) para despliegues masivos. El cierre del flujo con herramientas de escaneo (</w:t>
-      </w:r>
-      <w:proofErr w:type="spellStart"/>
-      <w:r>
-        <w:t>Wazuh</w:t>
-      </w:r>
-      <w:proofErr w:type="spellEnd"/>
-      <w:r>
-        <w:t>) asegura el cumplimiento continuo de la línea base aprobada.</w:t>
-      </w:r>
-    </w:p>
-    <w:p xmlns:wp14="http://schemas.microsoft.com/office/word/2010/wordml" wp14:textId="66F9E60A">
-      <w:pPr>
-        <w:rPr>
-          <w:b w:val="1"/>
-          <w:bCs w:val="1"/>
-        </w:rPr>
-      </w:pPr>
-      <w:r>
-        <w:rPr>
-          <w:b w:val="1"/>
-          <w:bCs w:val="1"/>
-        </w:rPr>
-        <w:t>3. Diagrama BPMN: Gestión de Respaldos y</w:t>
-      </w:r>
-      <w:r>
-        <w:rPr>
-          <w:b w:val="1"/>
-          <w:bCs w:val="1"/>
-        </w:rPr>
-        <w:t xml:space="preserve"> </w:t>
-      </w:r>
-      <w:r>
-        <w:rPr>
-          <w:b w:val="1"/>
-          <w:bCs w:val="1"/>
-        </w:rPr>
-        <w:t xml:space="preserve">de </w:t>
-      </w:r>
-      <w:r>
-        <w:rPr>
-          <w:b w:val="1"/>
-          <w:bCs w:val="1"/>
-        </w:rPr>
-        <w:t>Rollback</w:t>
-      </w:r>
-    </w:p>
-    <w:p xmlns:wp14="http://schemas.microsoft.com/office/word/2010/wordml" wp14:textId="77777777">
-      <w:r>
-        <w:rPr>
-          <w:b/>
-          <w:bCs/>
-        </w:rPr>
-        <w:t>Políticas y Procedimientos que lo fundamentan:</w:t>
-      </w:r>
-    </w:p>
-    <w:p xmlns:wp14="http://schemas.microsoft.com/office/word/2010/wordml" wp14:textId="77777777">
-      <w:pPr>
-        <w:numPr>
-          <w:ilvl w:val="0"/>
-          <w:numId w:val="3"/>
-        </w:numPr>
-      </w:pPr>
-      <w:r>
-        <w:rPr>
-          <w:b/>
-          <w:bCs/>
-        </w:rPr>
-        <w:t>POL-SGSI-03 — Política de respaldo y recuperación:</w:t>
-      </w:r>
-      <w:r>
-        <w:t xml:space="preserve"> Exige la estrategia 3-2-1, cifrado de reposo y pruebas de restauración documentadas. </w:t>
-      </w:r>
-    </w:p>
-    <w:p xmlns:wp14="http://schemas.microsoft.com/office/word/2010/wordml" wp14:textId="77777777">
-      <w:pPr>
-        <w:numPr>
-          <w:ilvl w:val="0"/>
-          <w:numId w:val="3"/>
-        </w:numPr>
-      </w:pPr>
-      <w:r>
-        <w:rPr>
-          <w:b/>
-          <w:bCs/>
-        </w:rPr>
-        <w:t>POL-SGSI-12 — Política de cifrado de datos:</w:t>
-      </w:r>
-      <w:r>
-        <w:t xml:space="preserve"> Obliga a cifrar las bases de datos de clientes y la información financiera. </w:t>
-      </w:r>
-    </w:p>
-    <w:p xmlns:wp14="http://schemas.microsoft.com/office/word/2010/wordml" wp14:textId="77777777">
-      <w:pPr>
-        <w:numPr>
-          <w:ilvl w:val="0"/>
-          <w:numId w:val="3"/>
-        </w:numPr>
-      </w:pPr>
-      <w:r>
-        <w:rPr>
-          <w:b/>
-          <w:bCs/>
-        </w:rPr>
-        <w:t xml:space="preserve">PROC-SGSI-03 — Procedimiento de </w:t>
-      </w:r>
-      <w:proofErr w:type="spellStart"/>
-      <w:r>
-        <w:rPr>
-          <w:b/>
-          <w:bCs/>
-        </w:rPr>
-        <w:t>rollback</w:t>
-      </w:r>
-      <w:proofErr w:type="spellEnd"/>
-      <w:r>
-        <w:rPr>
-          <w:b/>
-          <w:bCs/>
-        </w:rPr>
-        <w:t xml:space="preserve"> de sistemas y aplicaciones:</w:t>
-      </w:r>
-      <w:r>
-        <w:t xml:space="preserve"> Define los criterios y pasos para revertir sistemas al último estado estable conocido. </w:t>
-      </w:r>
-    </w:p>
-    <w:p xmlns:wp14="http://schemas.microsoft.com/office/word/2010/wordml" wp14:textId="77777777">
-      <w:r>
-        <w:rPr>
-          <w:b/>
-          <w:bCs/>
-        </w:rPr>
-        <w:t>Justificación del Flujo:</w:t>
-      </w:r>
-      <w:r>
-        <w:t xml:space="preserve"> El modelado no se limita a graficar la copia de archivos. El flujo operativo traza explícitamente las tareas de aplicación de cifrado criptográfico antes del almacenamiento, dando cumplimiento a la POL-SGSI-12. Además, la compuerta exclusiva de verificación obliga a Infraestructura TI a extraer una muestra periódica y ejecutar una prueba de </w:t>
-      </w:r>
-      <w:proofErr w:type="spellStart"/>
-      <w:r>
-        <w:t>Rollback</w:t>
-      </w:r>
-      <w:proofErr w:type="spellEnd"/>
-      <w:r>
-        <w:t xml:space="preserve"> en un ambiente aislado, derivando en la apertura de un incidente de seguridad en caso de fallo, garantizando así la resiliencia contra ataques de </w:t>
-      </w:r>
-      <w:proofErr w:type="spellStart"/>
-      <w:r>
-        <w:t>ransomware</w:t>
-      </w:r>
-      <w:proofErr w:type="spellEnd"/>
-      <w:r>
-        <w:t xml:space="preserve">. </w:t>
-      </w:r>
-    </w:p>
-    <w:p xmlns:wp14="http://schemas.microsoft.com/office/word/2010/wordml" wp14:textId="010992E7">
-      <w:pPr>
-        <w:rPr>
-          <w:b w:val="1"/>
-          <w:bCs w:val="1"/>
-        </w:rPr>
-      </w:pPr>
-      <w:r>
-        <w:rPr>
-          <w:b w:val="1"/>
-          <w:bCs w:val="1"/>
-        </w:rPr>
-        <w:t>4. Diagrama BPMN: Gestión de Incidentes de Seguridad</w:t>
-      </w:r>
-      <w:r>
-        <w:rPr>
-          <w:b w:val="1"/>
-          <w:bCs w:val="1"/>
-        </w:rPr>
-        <w:t xml:space="preserve"> y Sanciones</w:t>
-      </w:r>
-    </w:p>
-    <w:p xmlns:wp14="http://schemas.microsoft.com/office/word/2010/wordml" wp14:textId="77777777">
-      <w:r>
-        <w:rPr>
-          <w:b/>
-          <w:bCs/>
-        </w:rPr>
-        <w:t>Políticas y Procedimientos que lo fundamentan:</w:t>
-      </w:r>
-    </w:p>
-    <w:p xmlns:wp14="http://schemas.microsoft.com/office/word/2010/wordml" wp14:textId="77777777">
-      <w:pPr>
-        <w:numPr>
-          <w:ilvl w:val="0"/>
-          <w:numId w:val="4"/>
-        </w:numPr>
-      </w:pPr>
-      <w:r>
-        <w:rPr>
-          <w:b/>
-          <w:bCs/>
-        </w:rPr>
-        <w:t>POL-SGSI-11 — Política de gestión de incidentes de seguridad y reporte ANCI:</w:t>
-      </w:r>
-      <w:r>
-        <w:t xml:space="preserve"> Define los tiempos máximos de respuesta inicial y l</w:t>
-      </w:r>
-      <w:r>
-        <w:t>os plazos legales de reporte (como</w:t>
-      </w:r>
-      <w:r>
-        <w:t xml:space="preserve"> 3 horas para alerta temprana). </w:t>
-      </w:r>
-    </w:p>
-    <w:p xmlns:wp14="http://schemas.microsoft.com/office/word/2010/wordml" wp14:textId="77777777">
-      <w:pPr>
-        <w:numPr>
-          <w:ilvl w:val="0"/>
-          <w:numId w:val="4"/>
-        </w:numPr>
-      </w:pPr>
-      <w:r>
-        <w:rPr>
-          <w:b/>
-          <w:bCs/>
-        </w:rPr>
-        <w:t>POL-SGSI-13 — Política de gestión de proveedores y terceros OIV:</w:t>
-      </w:r>
-      <w:r>
-        <w:t xml:space="preserve"> Exige </w:t>
-      </w:r>
-      <w:proofErr w:type="spellStart"/>
-      <w:r>
-        <w:t>SLAs</w:t>
-      </w:r>
-      <w:proofErr w:type="spellEnd"/>
-      <w:r>
-        <w:t xml:space="preserve"> de seguridad a contratistas y prevé acciones ante incumplimientos. </w:t>
-      </w:r>
-    </w:p>
-    <w:p xmlns:wp14="http://schemas.microsoft.com/office/word/2010/wordml" wp14:textId="77777777">
-      <w:pPr>
-        <w:numPr>
-          <w:ilvl w:val="0"/>
-          <w:numId w:val="4"/>
-        </w:numPr>
-      </w:pPr>
-      <w:r>
-        <w:rPr>
-          <w:b/>
-          <w:bCs/>
-        </w:rPr>
-        <w:t>PROC-SGSI-05 — Procedimiento operativo de gestión de incidentes y reporte ANCI:</w:t>
-      </w:r>
-      <w:r>
-        <w:t xml:space="preserve"> Entrega el paso a paso del equipo de respuesta ante incidentes (ERI). </w:t>
-      </w:r>
-    </w:p>
-    <w:p xmlns:wp14="http://schemas.microsoft.com/office/word/2010/wordml" wp14:textId="77777777">
-      <w:r>
-        <w:rPr>
-          <w:b/>
-          <w:bCs/>
-        </w:rPr>
-        <w:t>Justificación del Flujo:</w:t>
-      </w:r>
-      <w:r>
-        <w:t xml:space="preserve"> El diagrama traza el ciclo de vida de un evento de seguridad anómalo. La pieza central del flujo es la compuerta de cumplimiento de SLA. Si la contención o erradicación del incidente excede los tiempos normativos, el diagrama </w:t>
-      </w:r>
-      <w:proofErr w:type="spellStart"/>
-      <w:r>
-        <w:t>enruta</w:t>
-      </w:r>
-      <w:proofErr w:type="spellEnd"/>
-      <w:r>
-        <w:t xml:space="preserve"> automáticamente el proceso hacia el carril de RRHH o del Comité de Seguridad para la evaluación de la falla y la posterior aplicación de sanciones administrativas o multas contractuales, </w:t>
-      </w:r>
-      <w:proofErr w:type="spellStart"/>
-      <w:r>
-        <w:t>tangibilizando</w:t>
-      </w:r>
-      <w:proofErr w:type="spellEnd"/>
-      <w:r>
-        <w:t xml:space="preserve"> la gobernanza exigida.</w:t>
-      </w:r>
-    </w:p>
-    <w:p xmlns:wp14="http://schemas.microsoft.com/office/word/2010/wordml" wp14:textId="77777777">
-      <w:bookmarkStart w:name="_GoBack" w:id="0"/>
-      <w:bookmarkEnd w:id="0"/>
     </w:p>
     <w:p>
       <w:r>
         <w:rPr>
           <w:b/>
+          <w:sz w:val="24"/>
         </w:rPr>
-        <w:t xml:space="preserve">5. Diagramas BPMN detallados por procedimiento (PROC-SGSI-05 / 13 / 14)</w:t>
+        <w:t>Control de cambios</w:t>
       </w:r>
     </w:p>
-    <w:p>
-      <w:r>
-        <w:t xml:space="preserve">Versiones detalladas y vigentes de los flujos, en 03-evidencias/diagramas/. Son la versión canónica; los diagramas previos (Desvinculación Segura, Incidentes y sanciones) se conservan como antecedente.</w:t>
-      </w:r>
-    </w:p>
-    <w:p>
-      <w:r>
-        <w:t xml:space="preserve">PROC-SGSI-05 — Gestión de incidentes y notificación ANCI. Plazos Ley 21.663: alerta temprana 3 horas; actualización 72 horas (24 horas si OIV afecta un servicio esencial); informe final 15 días corridos.</w:t>
-      </w:r>
-    </w:p>
-    <w:p>
-      <w:r>
-        <w:t xml:space="preserve">PROC-SGSI-13 — Contratación y desvinculación segura (onboarding/offboarding).</w:t>
-      </w:r>
-    </w:p>
-    <w:p>
-      <w:r>
-        <w:t xml:space="preserve">PROC-SGSI-14 — Evaluación y reevaluación de proveedores (incluye OIV).</w:t>
-      </w:r>
-    </w:p>
+    <w:tbl>
+      <w:tblPr>
+        <w:tblW w:type="auto" w:w="0"/>
+        <w:tblLook w:firstColumn="1" w:firstRow="1" w:lastColumn="0" w:lastRow="0" w:noHBand="0" w:noVBand="1" w:val="04A0"/>
+        <w:tblBorders>
+          <w:top w:val="single" w:sz="4" w:color="808080"/>
+          <w:left w:val="single" w:sz="4" w:color="808080"/>
+          <w:bottom w:val="single" w:sz="4" w:color="808080"/>
+          <w:right w:val="single" w:sz="4" w:color="808080"/>
+          <w:insideH w:val="single" w:sz="4" w:color="808080"/>
+          <w:insideV w:val="single" w:sz="4" w:color="808080"/>
+        </w:tblBorders>
+      </w:tblPr>
+      <w:tblGrid>
+        <w:gridCol w:w="2946"/>
+        <w:gridCol w:w="2946"/>
+        <w:gridCol w:w="2946"/>
+      </w:tblGrid>
+      <w:tr>
+        <w:tc>
+          <w:tcPr>
+            <w:tcW w:type="dxa" w:w="2946"/>
+          </w:tcPr>
+          <w:p>
+            <w:r>
+              <w:rPr>
+                <w:b/>
+              </w:rPr>
+              <w:t>Versión</w:t>
+            </w:r>
+          </w:p>
+        </w:tc>
+        <w:tc>
+          <w:tcPr>
+            <w:tcW w:type="dxa" w:w="2946"/>
+          </w:tcPr>
+          <w:p>
+            <w:r>
+              <w:rPr>
+                <w:b/>
+              </w:rPr>
+              <w:t>Fecha</w:t>
+            </w:r>
+          </w:p>
+        </w:tc>
+        <w:tc>
+          <w:tcPr>
+            <w:tcW w:type="dxa" w:w="2946"/>
+          </w:tcPr>
+          <w:p>
+            <w:r>
+              <w:rPr>
+                <w:b/>
+              </w:rPr>
+              <w:t>Descripción</w:t>
+            </w:r>
+          </w:p>
+        </w:tc>
+      </w:tr>
+      <w:tr>
+        <w:tc>
+          <w:tcPr>
+            <w:tcW w:type="dxa" w:w="2946"/>
+          </w:tcPr>
+          <w:p>
+            <w:r>
+              <w:t>2.0</w:t>
+            </w:r>
+          </w:p>
+        </w:tc>
+        <w:tc>
+          <w:tcPr>
+            <w:tcW w:type="dxa" w:w="2946"/>
+          </w:tcPr>
+          <w:p>
+            <w:r>
+              <w:t>17-06-2026</w:t>
+            </w:r>
+          </w:p>
+        </w:tc>
+        <w:tc>
+          <w:tcPr>
+            <w:tcW w:type="dxa" w:w="2946"/>
+          </w:tcPr>
+          <w:p>
+            <w:r>
+              <w:t>Set completo de 18 diagramas (uno por procedimiento); PROC-05 con plazos ANCI corregidos.</w:t>
+            </w:r>
+          </w:p>
+        </w:tc>
+      </w:tr>
+    </w:tbl>
     <w:sectPr>
       <w:pgSz w:w="12240" w:h="15840" w:orient="portrait"/>
       <w:pgMar w:top="1417" w:right="1701" w:bottom="1417" w:left="1701" w:header="708" w:footer="708" w:gutter="0"/>

</xml_diff>

<commit_message>
Diagramas: set completo de 33 (15 políticas + 18 procedimientos) en subcarpetas, con Mermaid
- Un diagrama por cada política (mapa de política: alcance → reglas → control →
  ¿cumple? → conforme/incumplimiento) y por cada procedimiento (flujo operativo).
- PNG en subcarpetas politicas/ y procedimientos/; fuente editable .svg en
  fuentes-svg/; índice navegable en Mermaid (DIAGRAMAS-POLITICAS.md y
  DIAGRAMAS-PROCEDIMIENTOS.md, se renderiza en GitHub).
- Cada diagrama incluye título con control ISO, decisiones Sí/No, hitos de
  cumplimiento (plazos ANCI 3 h/72 h/15 días en PROC-05 y POL-11) y leyenda de
  roles (RACI), evidencia y plazos.
- Elimina los 18 PNG/SVG planos anteriores (quedan en el historial).
- Actualiza READMEs, Gap Analysis y "Evidencias de diagramas.docx" (33 diagramas).

Co-Authored-By: Claude Opus 4.8 (1M context) <noreply@anthropic.com>
</commit_message>
<xml_diff>
--- a/03-evidencias/Evidencias de diagramas.docx
+++ b/03-evidencias/Evidencias de diagramas.docx
@@ -8,17 +8,26 @@
           <w:b/>
           <w:sz w:val="28"/>
         </w:rPr>
-        <w:t>Evidencias de diagramas BPMN del SGSI — NovaRetail SpA</w:t>
+        <w:t>Evidencias de diagramas del SGSI — NovaRetail SpA</w:t>
       </w:r>
     </w:p>
     <w:p>
       <w:r>
-        <w:t>La carpeta 03-evidencias/diagramas/ contiene un diagrama de flujo (BPMN) por cada uno de los 18 procedimientos del SGSI. Cada PNG va acompañado de su fuente editable en formato SVG (subcarpeta fuentes-svg/). Los diagramas modelan el flujo operativo del procedimiento y su trazabilidad con la política base.</w:t>
+        <w:t>La carpeta 03-evidencias/diagramas/ contiene 33 diagramas: 18 de procedimientos (flujo operativo BPMN) y 15 de políticas (mapa de política: alcance → reglas clave → control → ¿cumple? → conforme / gestión de incumplimiento). Los PNG están en las subcarpetas procedimientos/ y politicas/; la fuente editable .svg en fuentes-svg/. El índice navegable en GitHub (diagramas Mermaid) está en DIAGRAMAS-PROCEDIMIENTOS.md y DIAGRAMAS-POLITICAS.md.</w:t>
       </w:r>
     </w:p>
     <w:p>
       <w:r>
-        <w:t>Nota: el diagrama de PROC-SGSI-05 (gestión de incidentes) refleja los plazos de notificación de la Ley N° 21.663: alerta temprana ≤ 3 horas, actualización ≤ 72 horas (24 horas si la empresa es OIV y afecta un servicio esencial) e informe final ≤ 15 días corridos.</w:t>
+        <w:t>Nota: el diagrama de PROC-SGSI-05 (y POL-SGSI-11) refleja los plazos de la Ley N° 21.663: alerta temprana ≤ 3 horas, actualización ≤ 72 horas (24 horas si la empresa es OIV y afecta un servicio esencial) e informe final ≤ 15 días corridos.</w:t>
+      </w:r>
+    </w:p>
+    <w:p>
+      <w:r>
+        <w:rPr>
+          <w:b/>
+          <w:sz w:val="24"/>
+        </w:rPr>
+        <w:t>Procedimientos (carpeta procedimientos/)</w:t>
       </w:r>
     </w:p>
     <w:tbl>
@@ -659,7 +668,556 @@
     </w:tbl>
     <w:p>
       <w:r>
-        <w:t>Fuente editable: cada diagrama tiene su archivo .svg en 03-evidencias/diagramas/fuentes-svg/, regenerable a PNG.</w:t>
+        <w:rPr>
+          <w:b/>
+          <w:sz w:val="24"/>
+        </w:rPr>
+        <w:t>Políticas (carpeta politicas/)</w:t>
+      </w:r>
+    </w:p>
+    <w:tbl>
+      <w:tblPr>
+        <w:tblW w:type="auto" w:w="0"/>
+        <w:tblLook w:firstColumn="1" w:firstRow="1" w:lastColumn="0" w:lastRow="0" w:noHBand="0" w:noVBand="1" w:val="04A0"/>
+        <w:tblBorders>
+          <w:top w:val="single" w:sz="4" w:color="808080"/>
+          <w:left w:val="single" w:sz="4" w:color="808080"/>
+          <w:bottom w:val="single" w:sz="4" w:color="808080"/>
+          <w:right w:val="single" w:sz="4" w:color="808080"/>
+          <w:insideH w:val="single" w:sz="4" w:color="808080"/>
+          <w:insideV w:val="single" w:sz="4" w:color="808080"/>
+        </w:tblBorders>
+      </w:tblPr>
+      <w:tblGrid>
+        <w:gridCol w:w="2946"/>
+        <w:gridCol w:w="2946"/>
+        <w:gridCol w:w="2946"/>
+      </w:tblGrid>
+      <w:tr>
+        <w:tc>
+          <w:tcPr>
+            <w:tcW w:type="dxa" w:w="2946"/>
+          </w:tcPr>
+          <w:p>
+            <w:r>
+              <w:rPr>
+                <w:b/>
+              </w:rPr>
+              <w:t>Código</w:t>
+            </w:r>
+          </w:p>
+        </w:tc>
+        <w:tc>
+          <w:tcPr>
+            <w:tcW w:type="dxa" w:w="2946"/>
+          </w:tcPr>
+          <w:p>
+            <w:r>
+              <w:rPr>
+                <w:b/>
+              </w:rPr>
+              <w:t>Mapa de política</w:t>
+            </w:r>
+          </w:p>
+        </w:tc>
+        <w:tc>
+          <w:tcPr>
+            <w:tcW w:type="dxa" w:w="2946"/>
+          </w:tcPr>
+          <w:p>
+            <w:r>
+              <w:rPr>
+                <w:b/>
+              </w:rPr>
+              <w:t>Controles ISO 27001:2022</w:t>
+            </w:r>
+          </w:p>
+        </w:tc>
+      </w:tr>
+      <w:tr>
+        <w:tc>
+          <w:tcPr>
+            <w:tcW w:type="dxa" w:w="2946"/>
+          </w:tcPr>
+          <w:p>
+            <w:r>
+              <w:t>POL-SGSI-01</w:t>
+            </w:r>
+          </w:p>
+        </w:tc>
+        <w:tc>
+          <w:tcPr>
+            <w:tcW w:type="dxa" w:w="2946"/>
+          </w:tcPr>
+          <w:p>
+            <w:r>
+              <w:t>Control de acceso</w:t>
+            </w:r>
+          </w:p>
+        </w:tc>
+        <w:tc>
+          <w:tcPr>
+            <w:tcW w:type="dxa" w:w="2946"/>
+          </w:tcPr>
+          <w:p>
+            <w:r>
+              <w:t>5.15–5.18, 8.2, 8.3, 8.5</w:t>
+            </w:r>
+          </w:p>
+        </w:tc>
+      </w:tr>
+      <w:tr>
+        <w:tc>
+          <w:tcPr>
+            <w:tcW w:type="dxa" w:w="2946"/>
+          </w:tcPr>
+          <w:p>
+            <w:r>
+              <w:t>POL-SGSI-02</w:t>
+            </w:r>
+          </w:p>
+        </w:tc>
+        <w:tc>
+          <w:tcPr>
+            <w:tcW w:type="dxa" w:w="2946"/>
+          </w:tcPr>
+          <w:p>
+            <w:r>
+              <w:t>Gestión de contraseñas y autenticación</w:t>
+            </w:r>
+          </w:p>
+        </w:tc>
+        <w:tc>
+          <w:tcPr>
+            <w:tcW w:type="dxa" w:w="2946"/>
+          </w:tcPr>
+          <w:p>
+            <w:r>
+              <w:t>5.17, 8.5</w:t>
+            </w:r>
+          </w:p>
+        </w:tc>
+      </w:tr>
+      <w:tr>
+        <w:tc>
+          <w:tcPr>
+            <w:tcW w:type="dxa" w:w="2946"/>
+          </w:tcPr>
+          <w:p>
+            <w:r>
+              <w:t>POL-SGSI-03</w:t>
+            </w:r>
+          </w:p>
+        </w:tc>
+        <w:tc>
+          <w:tcPr>
+            <w:tcW w:type="dxa" w:w="2946"/>
+          </w:tcPr>
+          <w:p>
+            <w:r>
+              <w:t>Respaldo y recuperación</w:t>
+            </w:r>
+          </w:p>
+        </w:tc>
+        <w:tc>
+          <w:tcPr>
+            <w:tcW w:type="dxa" w:w="2946"/>
+          </w:tcPr>
+          <w:p>
+            <w:r>
+              <w:t>8.13, 8.14</w:t>
+            </w:r>
+          </w:p>
+        </w:tc>
+      </w:tr>
+      <w:tr>
+        <w:tc>
+          <w:tcPr>
+            <w:tcW w:type="dxa" w:w="2946"/>
+          </w:tcPr>
+          <w:p>
+            <w:r>
+              <w:t>POL-SGSI-04</w:t>
+            </w:r>
+          </w:p>
+        </w:tc>
+        <w:tc>
+          <w:tcPr>
+            <w:tcW w:type="dxa" w:w="2946"/>
+          </w:tcPr>
+          <w:p>
+            <w:r>
+              <w:t>Protección contra malware</w:t>
+            </w:r>
+          </w:p>
+        </w:tc>
+        <w:tc>
+          <w:tcPr>
+            <w:tcW w:type="dxa" w:w="2946"/>
+          </w:tcPr>
+          <w:p>
+            <w:r>
+              <w:t>8.7</w:t>
+            </w:r>
+          </w:p>
+        </w:tc>
+      </w:tr>
+      <w:tr>
+        <w:tc>
+          <w:tcPr>
+            <w:tcW w:type="dxa" w:w="2946"/>
+          </w:tcPr>
+          <w:p>
+            <w:r>
+              <w:t>POL-SGSI-05</w:t>
+            </w:r>
+          </w:p>
+        </w:tc>
+        <w:tc>
+          <w:tcPr>
+            <w:tcW w:type="dxa" w:w="2946"/>
+          </w:tcPr>
+          <w:p>
+            <w:r>
+              <w:t>Gestión de parches y actualización</w:t>
+            </w:r>
+          </w:p>
+        </w:tc>
+        <w:tc>
+          <w:tcPr>
+            <w:tcW w:type="dxa" w:w="2946"/>
+          </w:tcPr>
+          <w:p>
+            <w:r>
+              <w:t>8.8, 8.19</w:t>
+            </w:r>
+          </w:p>
+        </w:tc>
+      </w:tr>
+      <w:tr>
+        <w:tc>
+          <w:tcPr>
+            <w:tcW w:type="dxa" w:w="2946"/>
+          </w:tcPr>
+          <w:p>
+            <w:r>
+              <w:t>POL-SGSI-06</w:t>
+            </w:r>
+          </w:p>
+        </w:tc>
+        <w:tc>
+          <w:tcPr>
+            <w:tcW w:type="dxa" w:w="2946"/>
+          </w:tcPr>
+          <w:p>
+            <w:r>
+              <w:t>Uso seguro de dispositivos</w:t>
+            </w:r>
+          </w:p>
+        </w:tc>
+        <w:tc>
+          <w:tcPr>
+            <w:tcW w:type="dxa" w:w="2946"/>
+          </w:tcPr>
+          <w:p>
+            <w:r>
+              <w:t>6.7, 7.9, 8.1</w:t>
+            </w:r>
+          </w:p>
+        </w:tc>
+      </w:tr>
+      <w:tr>
+        <w:tc>
+          <w:tcPr>
+            <w:tcW w:type="dxa" w:w="2946"/>
+          </w:tcPr>
+          <w:p>
+            <w:r>
+              <w:t>POL-SGSI-07</w:t>
+            </w:r>
+          </w:p>
+        </w:tc>
+        <w:tc>
+          <w:tcPr>
+            <w:tcW w:type="dxa" w:w="2946"/>
+          </w:tcPr>
+          <w:p>
+            <w:r>
+              <w:t>Seguridad de red</w:t>
+            </w:r>
+          </w:p>
+        </w:tc>
+        <w:tc>
+          <w:tcPr>
+            <w:tcW w:type="dxa" w:w="2946"/>
+          </w:tcPr>
+          <w:p>
+            <w:r>
+              <w:t>8.20–8.23</w:t>
+            </w:r>
+          </w:p>
+        </w:tc>
+      </w:tr>
+      <w:tr>
+        <w:tc>
+          <w:tcPr>
+            <w:tcW w:type="dxa" w:w="2946"/>
+          </w:tcPr>
+          <w:p>
+            <w:r>
+              <w:t>POL-SGSI-08</w:t>
+            </w:r>
+          </w:p>
+        </w:tc>
+        <w:tc>
+          <w:tcPr>
+            <w:tcW w:type="dxa" w:w="2946"/>
+          </w:tcPr>
+          <w:p>
+            <w:r>
+              <w:t>Registro y monitoreo</w:t>
+            </w:r>
+          </w:p>
+        </w:tc>
+        <w:tc>
+          <w:tcPr>
+            <w:tcW w:type="dxa" w:w="2946"/>
+          </w:tcPr>
+          <w:p>
+            <w:r>
+              <w:t>8.15–8.17</w:t>
+            </w:r>
+          </w:p>
+        </w:tc>
+      </w:tr>
+      <w:tr>
+        <w:tc>
+          <w:tcPr>
+            <w:tcW w:type="dxa" w:w="2946"/>
+          </w:tcPr>
+          <w:p>
+            <w:r>
+              <w:t>POL-SGSI-09</w:t>
+            </w:r>
+          </w:p>
+        </w:tc>
+        <w:tc>
+          <w:tcPr>
+            <w:tcW w:type="dxa" w:w="2946"/>
+          </w:tcPr>
+          <w:p>
+            <w:r>
+              <w:t>Gestión de vulnerabilidades</w:t>
+            </w:r>
+          </w:p>
+        </w:tc>
+        <w:tc>
+          <w:tcPr>
+            <w:tcW w:type="dxa" w:w="2946"/>
+          </w:tcPr>
+          <w:p>
+            <w:r>
+              <w:t>8.8, 8.29</w:t>
+            </w:r>
+          </w:p>
+        </w:tc>
+      </w:tr>
+      <w:tr>
+        <w:tc>
+          <w:tcPr>
+            <w:tcW w:type="dxa" w:w="2946"/>
+          </w:tcPr>
+          <w:p>
+            <w:r>
+              <w:t>POL-SGSI-10</w:t>
+            </w:r>
+          </w:p>
+        </w:tc>
+        <w:tc>
+          <w:tcPr>
+            <w:tcW w:type="dxa" w:w="2946"/>
+          </w:tcPr>
+          <w:p>
+            <w:r>
+              <w:t>Manejo de información y clasificación</w:t>
+            </w:r>
+          </w:p>
+        </w:tc>
+        <w:tc>
+          <w:tcPr>
+            <w:tcW w:type="dxa" w:w="2946"/>
+          </w:tcPr>
+          <w:p>
+            <w:r>
+              <w:t>5.12–5.14, 8.10–8.12, 8.33</w:t>
+            </w:r>
+          </w:p>
+        </w:tc>
+      </w:tr>
+      <w:tr>
+        <w:tc>
+          <w:tcPr>
+            <w:tcW w:type="dxa" w:w="2946"/>
+          </w:tcPr>
+          <w:p>
+            <w:r>
+              <w:t>POL-SGSI-11</w:t>
+            </w:r>
+          </w:p>
+        </w:tc>
+        <w:tc>
+          <w:tcPr>
+            <w:tcW w:type="dxa" w:w="2946"/>
+          </w:tcPr>
+          <w:p>
+            <w:r>
+              <w:t>Gestión de incidentes y reporte ANCI</w:t>
+            </w:r>
+          </w:p>
+        </w:tc>
+        <w:tc>
+          <w:tcPr>
+            <w:tcW w:type="dxa" w:w="2946"/>
+          </w:tcPr>
+          <w:p>
+            <w:r>
+              <w:t>5.24–5.28</w:t>
+            </w:r>
+          </w:p>
+        </w:tc>
+      </w:tr>
+      <w:tr>
+        <w:tc>
+          <w:tcPr>
+            <w:tcW w:type="dxa" w:w="2946"/>
+          </w:tcPr>
+          <w:p>
+            <w:r>
+              <w:t>POL-SGSI-12</w:t>
+            </w:r>
+          </w:p>
+        </w:tc>
+        <w:tc>
+          <w:tcPr>
+            <w:tcW w:type="dxa" w:w="2946"/>
+          </w:tcPr>
+          <w:p>
+            <w:r>
+              <w:t>Cifrado de datos</w:t>
+            </w:r>
+          </w:p>
+        </w:tc>
+        <w:tc>
+          <w:tcPr>
+            <w:tcW w:type="dxa" w:w="2946"/>
+          </w:tcPr>
+          <w:p>
+            <w:r>
+              <w:t>8.24</w:t>
+            </w:r>
+          </w:p>
+        </w:tc>
+      </w:tr>
+      <w:tr>
+        <w:tc>
+          <w:tcPr>
+            <w:tcW w:type="dxa" w:w="2946"/>
+          </w:tcPr>
+          <w:p>
+            <w:r>
+              <w:t>POL-SGSI-13</w:t>
+            </w:r>
+          </w:p>
+        </w:tc>
+        <w:tc>
+          <w:tcPr>
+            <w:tcW w:type="dxa" w:w="2946"/>
+          </w:tcPr>
+          <w:p>
+            <w:r>
+              <w:t>Gestión de proveedores y terceros (OIV)</w:t>
+            </w:r>
+          </w:p>
+        </w:tc>
+        <w:tc>
+          <w:tcPr>
+            <w:tcW w:type="dxa" w:w="2946"/>
+          </w:tcPr>
+          <w:p>
+            <w:r>
+              <w:t>5.19–5.23</w:t>
+            </w:r>
+          </w:p>
+        </w:tc>
+      </w:tr>
+      <w:tr>
+        <w:tc>
+          <w:tcPr>
+            <w:tcW w:type="dxa" w:w="2946"/>
+          </w:tcPr>
+          <w:p>
+            <w:r>
+              <w:t>POL-SGSI-14</w:t>
+            </w:r>
+          </w:p>
+        </w:tc>
+        <w:tc>
+          <w:tcPr>
+            <w:tcW w:type="dxa" w:w="2946"/>
+          </w:tcPr>
+          <w:p>
+            <w:r>
+              <w:t>Contratación y desvinculación</w:t>
+            </w:r>
+          </w:p>
+        </w:tc>
+        <w:tc>
+          <w:tcPr>
+            <w:tcW w:type="dxa" w:w="2946"/>
+          </w:tcPr>
+          <w:p>
+            <w:r>
+              <w:t>6.1, 6.2, 6.4–6.6</w:t>
+            </w:r>
+          </w:p>
+        </w:tc>
+      </w:tr>
+      <w:tr>
+        <w:tc>
+          <w:tcPr>
+            <w:tcW w:type="dxa" w:w="2946"/>
+          </w:tcPr>
+          <w:p>
+            <w:r>
+              <w:t>POL-SGSI-15</w:t>
+            </w:r>
+          </w:p>
+        </w:tc>
+        <w:tc>
+          <w:tcPr>
+            <w:tcW w:type="dxa" w:w="2946"/>
+          </w:tcPr>
+          <w:p>
+            <w:r>
+              <w:t>Línea base de software</w:t>
+            </w:r>
+          </w:p>
+        </w:tc>
+        <w:tc>
+          <w:tcPr>
+            <w:tcW w:type="dxa" w:w="2946"/>
+          </w:tcPr>
+          <w:p>
+            <w:r>
+              <w:t>8.9, 8.19</w:t>
+            </w:r>
+          </w:p>
+        </w:tc>
+      </w:tr>
+    </w:tbl>
+    <w:p>
+      <w:r>
+        <w:t>Fuente editable: cada diagrama tiene su archivo .svg en fuentes-svg/ (subcarpetas politicas/ y procedimientos/), regenerable a PNG con rsvg-convert.</w:t>
       </w:r>
     </w:p>
     <w:p>
@@ -737,7 +1295,7 @@
           </w:tcPr>
           <w:p>
             <w:r>
-              <w:t>2.0</w:t>
+              <w:t>3.0</w:t>
             </w:r>
           </w:p>
         </w:tc>
@@ -757,7 +1315,7 @@
           </w:tcPr>
           <w:p>
             <w:r>
-              <w:t>Set completo de 18 diagramas (uno por procedimiento); PROC-05 con plazos ANCI corregidos.</w:t>
+              <w:t>33 diagramas (18 procedimientos + 15 políticas) en subcarpetas, con fuente SVG e índice Mermaid; PROC-05/POL-11 con plazos ANCI correctos.</w:t>
             </w:r>
           </w:p>
         </w:tc>

</xml_diff>

<commit_message>
Diagramas swimlane (carriles por rol) de los 4 procedimientos transversales
- Versión BPMN con carriles por rol (RACI) de PROC-05 (incidentes/ANCI),
  PROC-06 (accesos), PROC-13 (contratación/desvinculación) y PROC-14 (proveedores),
  en 03-evidencias/diagramas/swimlanes/ (PNG + fuente SVG).
- Índice Mermaid (subgraph por carril, se renderiza en GitHub): DIAGRAMAS-SWIMLANES.md.
- Actualiza READMEs (raíz, 03-evidencias) y "Evidencias de diagramas.docx".

Co-Authored-By: Claude Opus 4.8 (1M context) <noreply@anthropic.com>
</commit_message>
<xml_diff>
--- a/03-evidencias/Evidencias de diagramas.docx
+++ b/03-evidencias/Evidencias de diagramas.docx
@@ -1321,6 +1321,20 @@
         </w:tc>
       </w:tr>
     </w:tbl>
+    <w:p>
+      <w:r>
+        <w:rPr>
+          <w:b/>
+          <w:sz w:val="24"/>
+        </w:rPr>
+        <w:t>Diagramas swimlane (carriles por rol)</w:t>
+      </w:r>
+    </w:p>
+    <w:p>
+      <w:r>
+        <w:t>Para los procedimientos con varios responsables se incluye además una versión BPMN con carriles por rol (RACI) en la subcarpeta swimlanes/: PROC-SGSI-05 (incidentes), PROC-SGSI-06 (accesos), PROC-SGSI-13 (contratación/desvinculación) y PROC-SGSI-14 (proveedores). Índice Mermaid en DIAGRAMAS-SWIMLANES.md.</w:t>
+      </w:r>
+    </w:p>
     <w:sectPr>
       <w:pgSz w:w="12240" w:h="15840" w:orient="portrait"/>
       <w:pgMar w:top="1417" w:right="1701" w:bottom="1417" w:left="1701" w:header="708" w:footer="708" w:gutter="0"/>

</xml_diff>